<commit_message>
Day18-MultiAgent: guard both agent calls against failure, add project.md
Both the Copywriter and Editor GetChatMessageContentAsync calls were
unguarded - a transient Gemini failure would crash the whole session
mid-collaboration and take the in-progress transcript with it. Wraps
each in try/catch, cleans up the injected persona message on failure,
and reports "stopped early due to an error" instead of misleadingly
claiming max iterations were reached. Syncs the docx's Complete Code
listing and replaces missing.md with project.md.
</commit_message>
<xml_diff>
--- a/Day18-MultiAgent.docx
+++ b/Day18-MultiAgent.docx
@@ -110,19 +110,16 @@
         <w:ind w:left="1080"/>
       </w:pPr>
       <w:r>
-        <w:t>Note: The API key is read from the GEMINI_API_KEY environment variable; the progra</w:t>
-      </w:r>
+        <w:t>Note: The API key is read from the GEMINI_API_KEY environment variable; the program throws immediately if it is not set. Although the `Agents.Core` package is referenced by the project, this particular lesson deliberately does not use `ChatCompletionAgent` — it relies only on `IChatCompletionService` and `ChatHistory`, to keep the orchestration logic maximally visible and stable.</w:t>
+      </w:r>
+    </w:p>
+    <w:p/>
+    <w:p>
+      <w:pPr>
+        <w:pStyle w:val="Heading2"/>
+      </w:pPr>
       <w:r>
         <w:lastRenderedPageBreak/>
-        <w:t>m throws immediately if it is not set. Although the `Agents.Core` package is referenced by the project, this particular lesson deliberately does not use `ChatCompletionAgent` — it relies only on `IChatCompletionService` and `ChatHistory`, to keep the orchestration logic maximally visible and stable.</w:t>
-      </w:r>
-    </w:p>
-    <w:p/>
-    <w:p>
-      <w:pPr>
-        <w:pStyle w:val="Heading2"/>
-      </w:pPr>
-      <w:r>
         <w:t>3. Core Concepts Covered</w:t>
       </w:r>
     </w:p>
@@ -161,11 +158,7 @@
         <w:t>Shared Conversation Memory Across Agents</w:t>
       </w:r>
       <w:r>
-        <w:t xml:space="preserve">: Because both personas call `GetChatMessageContentAsync` against the *same* `chatHistory` object, the Editor can see exactly what the Copywriter wrote, and the Copywriter sees the </w:t>
-      </w:r>
-      <w:r>
-        <w:lastRenderedPageBreak/>
-        <w:t>Editor's critique on the next iteration — true shared memory without any explicit hand-off data structure.</w:t>
+        <w:t>: Because both personas call `GetChatMessageContentAsync` against the *same* `chatHistory` object, the Editor can see exactly what the Copywriter wrote, and the Copywriter sees the Editor's critique on the next iteration — true shared memory without any explicit hand-off data structure.</w:t>
       </w:r>
     </w:p>
     <w:p>
@@ -241,144 +234,141 @@
         <w:t>String-Based Approval Detection</w:t>
       </w:r>
       <w:r>
-        <w:t>: The loop checks `review.Contains("APPROVED", StringComparison.OrdinalIgnoreCase)` to decide whether the collaboration is finished — a simple, free-text convention rather</w:t>
-      </w:r>
-      <w:r>
+        <w:t>: The loop checks `review.Contains("APPROVED", StringComparison.OrdinalIgnoreCase)` to decide whether the collaboration is finished — a simple, free-text convention rather than a structured response (which Day 19 will replace with strict JSON).</w:t>
+      </w:r>
+    </w:p>
+    <w:p/>
+    <w:p>
+      <w:pPr>
+        <w:pStyle w:val="Heading2"/>
+      </w:pPr>
+      <w:r>
+        <w:t>4. Complete Code</w:t>
+      </w:r>
+    </w:p>
+    <w:p>
+      <w:pPr>
+        <w:rPr>
+          <w:b/>
+        </w:rPr>
+      </w:pPr>
+      <w:r>
+        <w:rPr>
+          <w:b/>
+        </w:rPr>
+        <w:t>Program.cs</w:t>
+      </w:r>
+    </w:p>
+    <w:p>
+      <w:pPr>
+        <w:pStyle w:val="NoSpacing"/>
+        <w:rPr>
+          <w:rFonts w:ascii="Consolas" w:hAnsi="Consolas"/>
+          <w:sz w:val="19"/>
+        </w:rPr>
+      </w:pPr>
+      <w:r>
+        <w:rPr>
+          <w:rFonts w:ascii="Consolas" w:hAnsi="Consolas"/>
+          <w:sz w:val="19"/>
+        </w:rPr>
+        <w:t>// Day 18: Native Multi-Agent Orchestration</w:t>
+      </w:r>
+    </w:p>
+    <w:p>
+      <w:pPr>
+        <w:pStyle w:val="NoSpacing"/>
+        <w:rPr>
+          <w:rFonts w:ascii="Consolas" w:hAnsi="Consolas"/>
+          <w:sz w:val="19"/>
+        </w:rPr>
+      </w:pPr>
+      <w:r>
+        <w:rPr>
+          <w:rFonts w:ascii="Consolas" w:hAnsi="Consolas"/>
+          <w:sz w:val="19"/>
+        </w:rPr>
+        <w:t>// ---------------------------------------------------------------------------</w:t>
+      </w:r>
+    </w:p>
+    <w:p>
+      <w:pPr>
+        <w:pStyle w:val="NoSpacing"/>
+        <w:rPr>
+          <w:rFonts w:ascii="Consolas" w:hAnsi="Consolas"/>
+          <w:sz w:val="19"/>
+        </w:rPr>
+      </w:pPr>
+      <w:r>
+        <w:rPr>
+          <w:rFonts w:ascii="Consolas" w:hAnsi="Consolas"/>
+          <w:sz w:val="19"/>
+        </w:rPr>
+        <w:t>// Two agents (Copywriter, Editor) collaborating over a single shared</w:t>
+      </w:r>
+    </w:p>
+    <w:p>
+      <w:pPr>
+        <w:pStyle w:val="NoSpacing"/>
+        <w:rPr>
+          <w:rFonts w:ascii="Consolas" w:hAnsi="Consolas"/>
+          <w:sz w:val="19"/>
+        </w:rPr>
+      </w:pPr>
+      <w:r>
+        <w:rPr>
+          <w:rFonts w:ascii="Consolas" w:hAnsi="Consolas"/>
+          <w:sz w:val="19"/>
+        </w:rPr>
+        <w:t>// ChatHistory via manual "persona swapping" - inserting a System message at</w:t>
+      </w:r>
+    </w:p>
+    <w:p>
+      <w:pPr>
+        <w:pStyle w:val="NoSpacing"/>
+        <w:rPr>
+          <w:rFonts w:ascii="Consolas" w:hAnsi="Consolas"/>
+          <w:sz w:val="19"/>
+        </w:rPr>
+      </w:pPr>
+      <w:r>
+        <w:rPr>
+          <w:rFonts w:ascii="Consolas" w:hAnsi="Consolas"/>
+          <w:sz w:val="19"/>
+        </w:rPr>
+        <w:t>// index 0 right before each agent speaks, then removing it once the reply</w:t>
+      </w:r>
+    </w:p>
+    <w:p>
+      <w:pPr>
+        <w:pStyle w:val="NoSpacing"/>
+        <w:rPr>
+          <w:rFonts w:ascii="Consolas" w:hAnsi="Consolas"/>
+          <w:sz w:val="19"/>
+        </w:rPr>
+      </w:pPr>
+      <w:r>
+        <w:rPr>
+          <w:rFonts w:ascii="Consolas" w:hAnsi="Consolas"/>
+          <w:sz w:val="19"/>
+        </w:rPr>
+        <w:t>// comes back. A plain C# while loop drives the whole thing, so the</w:t>
+      </w:r>
+    </w:p>
+    <w:p>
+      <w:pPr>
+        <w:pStyle w:val="NoSpacing"/>
+        <w:rPr>
+          <w:rFonts w:ascii="Consolas" w:hAnsi="Consolas"/>
+          <w:sz w:val="19"/>
+        </w:rPr>
+      </w:pPr>
+      <w:r>
+        <w:rPr>
+          <w:rFonts w:ascii="Consolas" w:hAnsi="Consolas"/>
+          <w:sz w:val="19"/>
+        </w:rPr>
         <w:lastRenderedPageBreak/>
-        <w:t xml:space="preserve"> than a structured response (which Day 19 will replace with strict JSON).</w:t>
-      </w:r>
-    </w:p>
-    <w:p/>
-    <w:p>
-      <w:pPr>
-        <w:pStyle w:val="Heading2"/>
-      </w:pPr>
-      <w:r>
-        <w:t>4. Complete Code</w:t>
-      </w:r>
-    </w:p>
-    <w:p>
-      <w:pPr>
-        <w:rPr>
-          <w:b/>
-        </w:rPr>
-      </w:pPr>
-      <w:r>
-        <w:rPr>
-          <w:b/>
-        </w:rPr>
-        <w:t>Program.cs</w:t>
-      </w:r>
-    </w:p>
-    <w:p>
-      <w:pPr>
-        <w:pStyle w:val="NoSpacing"/>
-        <w:rPr>
-          <w:rFonts w:ascii="Consolas" w:hAnsi="Consolas"/>
-          <w:sz w:val="19"/>
-        </w:rPr>
-      </w:pPr>
-      <w:r>
-        <w:rPr>
-          <w:rFonts w:ascii="Consolas" w:hAnsi="Consolas"/>
-          <w:sz w:val="19"/>
-        </w:rPr>
-        <w:t>// Day 18: Native Multi-Agent Orchestration</w:t>
-      </w:r>
-    </w:p>
-    <w:p>
-      <w:pPr>
-        <w:pStyle w:val="NoSpacing"/>
-        <w:rPr>
-          <w:rFonts w:ascii="Consolas" w:hAnsi="Consolas"/>
-          <w:sz w:val="19"/>
-        </w:rPr>
-      </w:pPr>
-      <w:r>
-        <w:rPr>
-          <w:rFonts w:ascii="Consolas" w:hAnsi="Consolas"/>
-          <w:sz w:val="19"/>
-        </w:rPr>
-        <w:t>// ---------------------------------------------------------------------------</w:t>
-      </w:r>
-    </w:p>
-    <w:p>
-      <w:pPr>
-        <w:pStyle w:val="NoSpacing"/>
-        <w:rPr>
-          <w:rFonts w:ascii="Consolas" w:hAnsi="Consolas"/>
-          <w:sz w:val="19"/>
-        </w:rPr>
-      </w:pPr>
-      <w:r>
-        <w:rPr>
-          <w:rFonts w:ascii="Consolas" w:hAnsi="Consolas"/>
-          <w:sz w:val="19"/>
-        </w:rPr>
-        <w:t>// Two agents (Copywriter, Editor) collaborating over a single shared</w:t>
-      </w:r>
-    </w:p>
-    <w:p>
-      <w:pPr>
-        <w:pStyle w:val="NoSpacing"/>
-        <w:rPr>
-          <w:rFonts w:ascii="Consolas" w:hAnsi="Consolas"/>
-          <w:sz w:val="19"/>
-        </w:rPr>
-      </w:pPr>
-      <w:r>
-        <w:rPr>
-          <w:rFonts w:ascii="Consolas" w:hAnsi="Consolas"/>
-          <w:sz w:val="19"/>
-        </w:rPr>
-        <w:t>// ChatHistory via manual "persona swapping" - inserting a System message at</w:t>
-      </w:r>
-    </w:p>
-    <w:p>
-      <w:pPr>
-        <w:pStyle w:val="NoSpacing"/>
-        <w:rPr>
-          <w:rFonts w:ascii="Consolas" w:hAnsi="Consolas"/>
-          <w:sz w:val="19"/>
-        </w:rPr>
-      </w:pPr>
-      <w:r>
-        <w:rPr>
-          <w:rFonts w:ascii="Consolas" w:hAnsi="Consolas"/>
-          <w:sz w:val="19"/>
-        </w:rPr>
-        <w:t>// index 0 right before each agent speaks, then removing it once the reply</w:t>
-      </w:r>
-    </w:p>
-    <w:p>
-      <w:pPr>
-        <w:pStyle w:val="NoSpacing"/>
-        <w:rPr>
-          <w:rFonts w:ascii="Consolas" w:hAnsi="Consolas"/>
-          <w:sz w:val="19"/>
-        </w:rPr>
-      </w:pPr>
-      <w:r>
-        <w:rPr>
-          <w:rFonts w:ascii="Consolas" w:hAnsi="Consolas"/>
-          <w:sz w:val="19"/>
-        </w:rPr>
-        <w:t>// comes back. A plain C# while loop drives the whole thing, so the</w:t>
-      </w:r>
-    </w:p>
-    <w:p>
-      <w:pPr>
-        <w:pStyle w:val="NoSpacing"/>
-        <w:rPr>
-          <w:rFonts w:ascii="Consolas" w:hAnsi="Consolas"/>
-          <w:sz w:val="19"/>
-        </w:rPr>
-      </w:pPr>
-      <w:r>
-        <w:rPr>
-          <w:rFonts w:ascii="Consolas" w:hAnsi="Consolas"/>
-          <w:sz w:val="19"/>
-        </w:rPr>
         <w:t>// hand-off logic between agents stays fully visible instead of being hidden</w:t>
       </w:r>
     </w:p>
@@ -705,822 +695,1254 @@
           <w:rFonts w:ascii="Consolas" w:hAnsi="Consolas"/>
           <w:sz w:val="19"/>
         </w:rPr>
-        <w:t xml:space="preserve">  </w:t>
-      </w:r>
+        <w:t xml:space="preserve">            // 2. Get the chat service</w:t>
+      </w:r>
+    </w:p>
+    <w:p>
+      <w:pPr>
+        <w:pStyle w:val="NoSpacing"/>
+        <w:rPr>
+          <w:rFonts w:ascii="Consolas" w:hAnsi="Consolas"/>
+          <w:sz w:val="19"/>
+        </w:rPr>
+      </w:pPr>
+      <w:r>
+        <w:rPr>
+          <w:rFonts w:ascii="Consolas" w:hAnsi="Consolas"/>
+          <w:sz w:val="19"/>
+        </w:rPr>
+        <w:t xml:space="preserve">            IChatCompletionService chatService = kernel.GetRequiredService&lt;IChatCompletionService&gt;();</w:t>
+      </w:r>
+    </w:p>
+    <w:p>
+      <w:pPr>
+        <w:pStyle w:val="NoSpacing"/>
+        <w:rPr>
+          <w:rFonts w:ascii="Consolas" w:hAnsi="Consolas"/>
+          <w:sz w:val="19"/>
+        </w:rPr>
+      </w:pPr>
+    </w:p>
+    <w:p>
+      <w:pPr>
+        <w:pStyle w:val="NoSpacing"/>
+        <w:rPr>
+          <w:rFonts w:ascii="Consolas" w:hAnsi="Consolas"/>
+          <w:sz w:val="19"/>
+        </w:rPr>
+      </w:pPr>
+      <w:r>
+        <w:rPr>
+          <w:rFonts w:ascii="Consolas" w:hAnsi="Consolas"/>
+          <w:sz w:val="19"/>
+        </w:rPr>
+        <w:t xml:space="preserve">            // 3. Define the Specialist Personas</w:t>
+      </w:r>
+    </w:p>
+    <w:p>
+      <w:pPr>
+        <w:pStyle w:val="NoSpacing"/>
+        <w:rPr>
+          <w:rFonts w:ascii="Consolas" w:hAnsi="Consolas"/>
+          <w:sz w:val="19"/>
+        </w:rPr>
+      </w:pPr>
+      <w:r>
+        <w:rPr>
+          <w:rFonts w:ascii="Consolas" w:hAnsi="Consolas"/>
+          <w:sz w:val="19"/>
+        </w:rPr>
+        <w:t xml:space="preserve">            string copywriterPersona = "You are a creative copywriter.  Write a punch 5-word slogan for the product provided.";</w:t>
+      </w:r>
+    </w:p>
+    <w:p>
+      <w:pPr>
+        <w:pStyle w:val="NoSpacing"/>
+        <w:rPr>
+          <w:rFonts w:ascii="Consolas" w:hAnsi="Consolas"/>
+          <w:sz w:val="19"/>
+        </w:rPr>
+      </w:pPr>
+      <w:r>
+        <w:rPr>
+          <w:rFonts w:ascii="Consolas" w:hAnsi="Consolas"/>
+          <w:sz w:val="19"/>
+        </w:rPr>
+        <w:t xml:space="preserve">            string editorPersona = "You are a brand editor.  Review the slogan.  If it's perfect, say 'APPROVED'.  If not, provide one suggestion";</w:t>
+      </w:r>
+    </w:p>
+    <w:p>
+      <w:pPr>
+        <w:pStyle w:val="NoSpacing"/>
+        <w:rPr>
+          <w:rFonts w:ascii="Consolas" w:hAnsi="Consolas"/>
+          <w:sz w:val="19"/>
+        </w:rPr>
+      </w:pPr>
+    </w:p>
+    <w:p>
+      <w:pPr>
+        <w:pStyle w:val="NoSpacing"/>
+        <w:rPr>
+          <w:rFonts w:ascii="Consolas" w:hAnsi="Consolas"/>
+          <w:sz w:val="19"/>
+        </w:rPr>
+      </w:pPr>
+      <w:r>
+        <w:rPr>
+          <w:rFonts w:ascii="Consolas" w:hAnsi="Consolas"/>
+          <w:sz w:val="19"/>
+        </w:rPr>
+        <w:t xml:space="preserve">            // 4. Shared conversation history</w:t>
+      </w:r>
+    </w:p>
+    <w:p>
+      <w:pPr>
+        <w:pStyle w:val="NoSpacing"/>
+        <w:rPr>
+          <w:rFonts w:ascii="Consolas" w:hAnsi="Consolas"/>
+          <w:sz w:val="19"/>
+        </w:rPr>
+      </w:pPr>
+      <w:r>
+        <w:rPr>
+          <w:rFonts w:ascii="Consolas" w:hAnsi="Consolas"/>
+          <w:sz w:val="19"/>
+        </w:rPr>
+        <w:t xml:space="preserve">            ChatHistory chatHistory = new ChatHistory();</w:t>
+      </w:r>
+    </w:p>
+    <w:p>
+      <w:pPr>
+        <w:pStyle w:val="NoSpacing"/>
+        <w:rPr>
+          <w:rFonts w:ascii="Consolas" w:hAnsi="Consolas"/>
+          <w:sz w:val="19"/>
+        </w:rPr>
+      </w:pPr>
+    </w:p>
+    <w:p>
+      <w:pPr>
+        <w:pStyle w:val="NoSpacing"/>
+        <w:rPr>
+          <w:rFonts w:ascii="Consolas" w:hAnsi="Consolas"/>
+          <w:sz w:val="19"/>
+        </w:rPr>
+      </w:pPr>
+      <w:r>
+        <w:rPr>
+          <w:rFonts w:ascii="Consolas" w:hAnsi="Consolas"/>
+          <w:sz w:val="19"/>
+        </w:rPr>
+        <w:t xml:space="preserve">            Console.WriteLine("Enter a product to market:");</w:t>
+      </w:r>
+    </w:p>
+    <w:p>
+      <w:pPr>
+        <w:pStyle w:val="NoSpacing"/>
+        <w:rPr>
+          <w:rFonts w:ascii="Consolas" w:hAnsi="Consolas"/>
+          <w:sz w:val="19"/>
+        </w:rPr>
+      </w:pPr>
+      <w:r>
+        <w:rPr>
+          <w:rFonts w:ascii="Consolas" w:hAnsi="Consolas"/>
+          <w:sz w:val="19"/>
+        </w:rPr>
+        <w:t xml:space="preserve">            string? product = Console.ReadLine();</w:t>
+      </w:r>
+    </w:p>
+    <w:p>
+      <w:pPr>
+        <w:pStyle w:val="NoSpacing"/>
+        <w:rPr>
+          <w:rFonts w:ascii="Consolas" w:hAnsi="Consolas"/>
+          <w:sz w:val="19"/>
+        </w:rPr>
+      </w:pPr>
+    </w:p>
+    <w:p>
+      <w:pPr>
+        <w:pStyle w:val="NoSpacing"/>
+        <w:rPr>
+          <w:rFonts w:ascii="Consolas" w:hAnsi="Consolas"/>
+          <w:sz w:val="19"/>
+        </w:rPr>
+      </w:pPr>
+      <w:r>
+        <w:rPr>
+          <w:rFonts w:ascii="Consolas" w:hAnsi="Consolas"/>
+          <w:sz w:val="19"/>
+        </w:rPr>
+        <w:t xml:space="preserve">            if (string.IsNullOrWhiteSpace(product)) return;</w:t>
+      </w:r>
+    </w:p>
+    <w:p>
+      <w:pPr>
+        <w:pStyle w:val="NoSpacing"/>
+        <w:rPr>
+          <w:rFonts w:ascii="Consolas" w:hAnsi="Consolas"/>
+          <w:sz w:val="19"/>
+        </w:rPr>
+      </w:pPr>
+      <w:r>
+        <w:rPr>
+          <w:rFonts w:ascii="Consolas" w:hAnsi="Consolas"/>
+          <w:sz w:val="19"/>
+        </w:rPr>
+        <w:t xml:space="preserve">            chatHistory.AddUserMessage($"Product: {product}");</w:t>
+      </w:r>
+    </w:p>
+    <w:p>
+      <w:pPr>
+        <w:pStyle w:val="NoSpacing"/>
+        <w:rPr>
+          <w:rFonts w:ascii="Consolas" w:hAnsi="Consolas"/>
+          <w:sz w:val="19"/>
+        </w:rPr>
+      </w:pPr>
+    </w:p>
+    <w:p>
+      <w:pPr>
+        <w:pStyle w:val="NoSpacing"/>
+        <w:rPr>
+          <w:rFonts w:ascii="Consolas" w:hAnsi="Consolas"/>
+          <w:sz w:val="19"/>
+        </w:rPr>
+      </w:pPr>
+      <w:r>
+        <w:rPr>
+          <w:rFonts w:ascii="Consolas" w:hAnsi="Consolas"/>
+          <w:sz w:val="19"/>
+        </w:rPr>
+        <w:t xml:space="preserve">            bool isComplete = false;</w:t>
+      </w:r>
+    </w:p>
+    <w:p>
+      <w:pPr>
+        <w:pStyle w:val="NoSpacing"/>
+        <w:rPr>
+          <w:rFonts w:ascii="Consolas" w:hAnsi="Consolas"/>
+          <w:sz w:val="19"/>
+        </w:rPr>
+      </w:pPr>
+      <w:r>
+        <w:rPr>
+          <w:rFonts w:ascii="Consolas" w:hAnsi="Consolas"/>
+          <w:sz w:val="19"/>
+        </w:rPr>
+        <w:t xml:space="preserve">            bool hadError = false;</w:t>
+      </w:r>
+    </w:p>
+    <w:p>
+      <w:pPr>
+        <w:pStyle w:val="NoSpacing"/>
+        <w:rPr>
+          <w:rFonts w:ascii="Consolas" w:hAnsi="Consolas"/>
+          <w:sz w:val="19"/>
+        </w:rPr>
+      </w:pPr>
+      <w:r>
+        <w:rPr>
+          <w:rFonts w:ascii="Consolas" w:hAnsi="Consolas"/>
+          <w:sz w:val="19"/>
+        </w:rPr>
+        <w:t xml:space="preserve">            int currentIteration = 0;</w:t>
+      </w:r>
+    </w:p>
+    <w:p>
+      <w:pPr>
+        <w:pStyle w:val="NoSpacing"/>
+        <w:rPr>
+          <w:rFonts w:ascii="Consolas" w:hAnsi="Consolas"/>
+          <w:sz w:val="19"/>
+        </w:rPr>
+      </w:pPr>
+      <w:r>
+        <w:rPr>
+          <w:rFonts w:ascii="Consolas" w:hAnsi="Consolas"/>
+          <w:sz w:val="19"/>
+        </w:rPr>
+        <w:t xml:space="preserve">            int MaxIterations = 4;</w:t>
+      </w:r>
+    </w:p>
+    <w:p>
+      <w:pPr>
+        <w:pStyle w:val="NoSpacing"/>
+        <w:rPr>
+          <w:rFonts w:ascii="Consolas" w:hAnsi="Consolas"/>
+          <w:sz w:val="19"/>
+        </w:rPr>
+      </w:pPr>
+    </w:p>
+    <w:p>
+      <w:pPr>
+        <w:pStyle w:val="NoSpacing"/>
+        <w:rPr>
+          <w:rFonts w:ascii="Consolas" w:hAnsi="Consolas"/>
+          <w:sz w:val="19"/>
+        </w:rPr>
+      </w:pPr>
+      <w:r>
+        <w:rPr>
+          <w:rFonts w:ascii="Consolas" w:hAnsi="Consolas"/>
+          <w:sz w:val="19"/>
+        </w:rPr>
+        <w:t xml:space="preserve">            Console.WriteLine("\n Multi-Agent collaboration started...");</w:t>
+      </w:r>
+    </w:p>
+    <w:p>
+      <w:pPr>
+        <w:pStyle w:val="NoSpacing"/>
+        <w:rPr>
+          <w:rFonts w:ascii="Consolas" w:hAnsi="Consolas"/>
+          <w:sz w:val="19"/>
+        </w:rPr>
+      </w:pPr>
+    </w:p>
+    <w:p>
+      <w:pPr>
+        <w:pStyle w:val="NoSpacing"/>
+        <w:rPr>
+          <w:rFonts w:ascii="Consolas" w:hAnsi="Consolas"/>
+          <w:sz w:val="19"/>
+        </w:rPr>
+      </w:pPr>
+      <w:r>
+        <w:rPr>
+          <w:rFonts w:ascii="Consolas" w:hAnsi="Consolas"/>
+          <w:sz w:val="19"/>
+        </w:rPr>
+        <w:t xml:space="preserve">            while (!isComplete &amp;&amp; currentIteration &lt; MaxIterations)</w:t>
+      </w:r>
+    </w:p>
+    <w:p>
+      <w:pPr>
+        <w:pStyle w:val="NoSpacing"/>
+        <w:rPr>
+          <w:rFonts w:ascii="Consolas" w:hAnsi="Consolas"/>
+          <w:sz w:val="19"/>
+        </w:rPr>
+      </w:pPr>
+      <w:r>
+        <w:rPr>
+          <w:rFonts w:ascii="Consolas" w:hAnsi="Consolas"/>
+          <w:sz w:val="19"/>
+        </w:rPr>
+        <w:t xml:space="preserve">            {</w:t>
+      </w:r>
+    </w:p>
+    <w:p>
+      <w:pPr>
+        <w:pStyle w:val="NoSpacing"/>
+        <w:rPr>
+          <w:rFonts w:ascii="Consolas" w:hAnsi="Consolas"/>
+          <w:sz w:val="19"/>
+        </w:rPr>
+      </w:pPr>
+      <w:r>
+        <w:rPr>
+          <w:rFonts w:ascii="Consolas" w:hAnsi="Consolas"/>
+          <w:sz w:val="19"/>
+        </w:rPr>
+        <w:t xml:space="preserve">                // ---------------------------</w:t>
+      </w:r>
+    </w:p>
+    <w:p>
+      <w:pPr>
+        <w:pStyle w:val="NoSpacing"/>
+        <w:rPr>
+          <w:rFonts w:ascii="Consolas" w:hAnsi="Consolas"/>
+          <w:sz w:val="19"/>
+        </w:rPr>
+      </w:pPr>
+      <w:r>
+        <w:rPr>
+          <w:rFonts w:ascii="Consolas" w:hAnsi="Consolas"/>
+          <w:sz w:val="19"/>
+        </w:rPr>
+        <w:t xml:space="preserve">                // Copywriter turn</w:t>
+      </w:r>
+    </w:p>
+    <w:p>
+      <w:pPr>
+        <w:pStyle w:val="NoSpacing"/>
+        <w:rPr>
+          <w:rFonts w:ascii="Consolas" w:hAnsi="Consolas"/>
+          <w:sz w:val="19"/>
+        </w:rPr>
+      </w:pPr>
+      <w:r>
+        <w:rPr>
+          <w:rFonts w:ascii="Consolas" w:hAnsi="Consolas"/>
+          <w:sz w:val="19"/>
+        </w:rPr>
+        <w:t xml:space="preserve">                // ---------------------------</w:t>
+      </w:r>
+    </w:p>
+    <w:p>
+      <w:pPr>
+        <w:pStyle w:val="NoSpacing"/>
+        <w:rPr>
+          <w:rFonts w:ascii="Consolas" w:hAnsi="Consolas"/>
+          <w:sz w:val="19"/>
+        </w:rPr>
+      </w:pPr>
+    </w:p>
+    <w:p>
+      <w:pPr>
+        <w:pStyle w:val="NoSpacing"/>
+        <w:rPr>
+          <w:rFonts w:ascii="Consolas" w:hAnsi="Consolas"/>
+          <w:sz w:val="19"/>
+        </w:rPr>
+      </w:pPr>
+      <w:r>
+        <w:rPr>
+          <w:rFonts w:ascii="Consolas" w:hAnsi="Consolas"/>
+          <w:sz w:val="19"/>
+        </w:rPr>
+        <w:t xml:space="preserve">                // Inject the persona at index 0</w:t>
+      </w:r>
+    </w:p>
+    <w:p>
+      <w:pPr>
+        <w:pStyle w:val="NoSpacing"/>
+        <w:rPr>
+          <w:rFonts w:ascii="Consolas" w:hAnsi="Consolas"/>
+          <w:sz w:val="19"/>
+        </w:rPr>
+      </w:pPr>
       <w:r>
         <w:rPr>
           <w:rFonts w:ascii="Consolas" w:hAnsi="Consolas"/>
           <w:sz w:val="19"/>
         </w:rPr>
         <w:lastRenderedPageBreak/>
-        <w:t xml:space="preserve">          // 2. Get the chat service</w:t>
-      </w:r>
-    </w:p>
-    <w:p>
-      <w:pPr>
-        <w:pStyle w:val="NoSpacing"/>
-        <w:rPr>
-          <w:rFonts w:ascii="Consolas" w:hAnsi="Consolas"/>
-          <w:sz w:val="19"/>
-        </w:rPr>
-      </w:pPr>
-      <w:r>
-        <w:rPr>
-          <w:rFonts w:ascii="Consolas" w:hAnsi="Consolas"/>
-          <w:sz w:val="19"/>
-        </w:rPr>
-        <w:t xml:space="preserve">            IChatCompletionService chatService = kernel.GetRequiredService&lt;IChatCompletionService&gt;();</w:t>
-      </w:r>
-    </w:p>
-    <w:p>
-      <w:pPr>
-        <w:pStyle w:val="NoSpacing"/>
-        <w:rPr>
-          <w:rFonts w:ascii="Consolas" w:hAnsi="Consolas"/>
-          <w:sz w:val="19"/>
-        </w:rPr>
-      </w:pPr>
-    </w:p>
-    <w:p>
-      <w:pPr>
-        <w:pStyle w:val="NoSpacing"/>
-        <w:rPr>
-          <w:rFonts w:ascii="Consolas" w:hAnsi="Consolas"/>
-          <w:sz w:val="19"/>
-        </w:rPr>
-      </w:pPr>
-      <w:r>
-        <w:rPr>
-          <w:rFonts w:ascii="Consolas" w:hAnsi="Consolas"/>
-          <w:sz w:val="19"/>
-        </w:rPr>
-        <w:t xml:space="preserve">            // 3. Define the Specialist Personas</w:t>
-      </w:r>
-    </w:p>
-    <w:p>
-      <w:pPr>
-        <w:pStyle w:val="NoSpacing"/>
-        <w:rPr>
-          <w:rFonts w:ascii="Consolas" w:hAnsi="Consolas"/>
-          <w:sz w:val="19"/>
-        </w:rPr>
-      </w:pPr>
-      <w:r>
-        <w:rPr>
-          <w:rFonts w:ascii="Consolas" w:hAnsi="Consolas"/>
-          <w:sz w:val="19"/>
-        </w:rPr>
-        <w:t xml:space="preserve">            string copywriterPersona = "You are a creative copywriter.  Write a punch 5-word slogan for the product provided.";</w:t>
-      </w:r>
-    </w:p>
-    <w:p>
-      <w:pPr>
-        <w:pStyle w:val="NoSpacing"/>
-        <w:rPr>
-          <w:rFonts w:ascii="Consolas" w:hAnsi="Consolas"/>
-          <w:sz w:val="19"/>
-        </w:rPr>
-      </w:pPr>
-      <w:r>
-        <w:rPr>
-          <w:rFonts w:ascii="Consolas" w:hAnsi="Consolas"/>
-          <w:sz w:val="19"/>
-        </w:rPr>
-        <w:t xml:space="preserve">            string editorPersona = "You are a brand editor.  Review the slogan.  If it's perfect, say 'APPROVED'.  If not, provide one suggestion";</w:t>
-      </w:r>
-    </w:p>
-    <w:p>
-      <w:pPr>
-        <w:pStyle w:val="NoSpacing"/>
-        <w:rPr>
-          <w:rFonts w:ascii="Consolas" w:hAnsi="Consolas"/>
-          <w:sz w:val="19"/>
-        </w:rPr>
-      </w:pPr>
-    </w:p>
-    <w:p>
-      <w:pPr>
-        <w:pStyle w:val="NoSpacing"/>
-        <w:rPr>
-          <w:rFonts w:ascii="Consolas" w:hAnsi="Consolas"/>
-          <w:sz w:val="19"/>
-        </w:rPr>
-      </w:pPr>
-      <w:r>
-        <w:rPr>
-          <w:rFonts w:ascii="Consolas" w:hAnsi="Consolas"/>
-          <w:sz w:val="19"/>
-        </w:rPr>
-        <w:t xml:space="preserve">            // 4. Shared conversation history</w:t>
-      </w:r>
-    </w:p>
-    <w:p>
-      <w:pPr>
-        <w:pStyle w:val="NoSpacing"/>
-        <w:rPr>
-          <w:rFonts w:ascii="Consolas" w:hAnsi="Consolas"/>
-          <w:sz w:val="19"/>
-        </w:rPr>
-      </w:pPr>
-      <w:r>
-        <w:rPr>
-          <w:rFonts w:ascii="Consolas" w:hAnsi="Consolas"/>
-          <w:sz w:val="19"/>
-        </w:rPr>
-        <w:t xml:space="preserve">            ChatHistory chatHistory = new ChatHistory();</w:t>
-      </w:r>
-    </w:p>
-    <w:p>
-      <w:pPr>
-        <w:pStyle w:val="NoSpacing"/>
-        <w:rPr>
-          <w:rFonts w:ascii="Consolas" w:hAnsi="Consolas"/>
-          <w:sz w:val="19"/>
-        </w:rPr>
-      </w:pPr>
-    </w:p>
-    <w:p>
-      <w:pPr>
-        <w:pStyle w:val="NoSpacing"/>
-        <w:rPr>
-          <w:rFonts w:ascii="Consolas" w:hAnsi="Consolas"/>
-          <w:sz w:val="19"/>
-        </w:rPr>
-      </w:pPr>
-      <w:r>
-        <w:rPr>
-          <w:rFonts w:ascii="Consolas" w:hAnsi="Consolas"/>
-          <w:sz w:val="19"/>
-        </w:rPr>
-        <w:t xml:space="preserve">            Console.WriteLine("Enter a product to market:");</w:t>
-      </w:r>
-    </w:p>
-    <w:p>
-      <w:pPr>
-        <w:pStyle w:val="NoSpacing"/>
-        <w:rPr>
-          <w:rFonts w:ascii="Consolas" w:hAnsi="Consolas"/>
-          <w:sz w:val="19"/>
-        </w:rPr>
-      </w:pPr>
-      <w:r>
-        <w:rPr>
-          <w:rFonts w:ascii="Consolas" w:hAnsi="Consolas"/>
-          <w:sz w:val="19"/>
-        </w:rPr>
-        <w:t xml:space="preserve">            string? product = Console.ReadLine();</w:t>
-      </w:r>
-    </w:p>
-    <w:p>
-      <w:pPr>
-        <w:pStyle w:val="NoSpacing"/>
-        <w:rPr>
-          <w:rFonts w:ascii="Consolas" w:hAnsi="Consolas"/>
-          <w:sz w:val="19"/>
-        </w:rPr>
-      </w:pPr>
-    </w:p>
-    <w:p>
-      <w:pPr>
-        <w:pStyle w:val="NoSpacing"/>
-        <w:rPr>
-          <w:rFonts w:ascii="Consolas" w:hAnsi="Consolas"/>
-          <w:sz w:val="19"/>
-        </w:rPr>
-      </w:pPr>
-      <w:r>
-        <w:rPr>
-          <w:rFonts w:ascii="Consolas" w:hAnsi="Consolas"/>
-          <w:sz w:val="19"/>
-        </w:rPr>
-        <w:t xml:space="preserve">            if (string.IsNullOrWhiteSpace(product)) return;</w:t>
-      </w:r>
-    </w:p>
-    <w:p>
-      <w:pPr>
-        <w:pStyle w:val="NoSpacing"/>
-        <w:rPr>
-          <w:rFonts w:ascii="Consolas" w:hAnsi="Consolas"/>
-          <w:sz w:val="19"/>
-        </w:rPr>
-      </w:pPr>
-      <w:r>
-        <w:rPr>
-          <w:rFonts w:ascii="Consolas" w:hAnsi="Consolas"/>
-          <w:sz w:val="19"/>
-        </w:rPr>
-        <w:t xml:space="preserve">            chatHistory.AddUserMessage($"Product: {product}");</w:t>
-      </w:r>
-    </w:p>
-    <w:p>
-      <w:pPr>
-        <w:pStyle w:val="NoSpacing"/>
-        <w:rPr>
-          <w:rFonts w:ascii="Consolas" w:hAnsi="Consolas"/>
-          <w:sz w:val="19"/>
-        </w:rPr>
-      </w:pPr>
-    </w:p>
-    <w:p>
-      <w:pPr>
-        <w:pStyle w:val="NoSpacing"/>
-        <w:rPr>
-          <w:rFonts w:ascii="Consolas" w:hAnsi="Consolas"/>
-          <w:sz w:val="19"/>
-        </w:rPr>
-      </w:pPr>
-      <w:r>
-        <w:rPr>
-          <w:rFonts w:ascii="Consolas" w:hAnsi="Consolas"/>
-          <w:sz w:val="19"/>
-        </w:rPr>
-        <w:t xml:space="preserve">            bool isComplete = false;</w:t>
-      </w:r>
-    </w:p>
-    <w:p>
-      <w:pPr>
-        <w:pStyle w:val="NoSpacing"/>
-        <w:rPr>
-          <w:rFonts w:ascii="Consolas" w:hAnsi="Consolas"/>
-          <w:sz w:val="19"/>
-        </w:rPr>
-      </w:pPr>
-      <w:r>
-        <w:rPr>
-          <w:rFonts w:ascii="Consolas" w:hAnsi="Consolas"/>
-          <w:sz w:val="19"/>
-        </w:rPr>
-        <w:t xml:space="preserve">            int currentIteration = 0;</w:t>
-      </w:r>
-    </w:p>
-    <w:p>
-      <w:pPr>
-        <w:pStyle w:val="NoSpacing"/>
-        <w:rPr>
-          <w:rFonts w:ascii="Consolas" w:hAnsi="Consolas"/>
-          <w:sz w:val="19"/>
-        </w:rPr>
-      </w:pPr>
-      <w:r>
-        <w:rPr>
-          <w:rFonts w:ascii="Consolas" w:hAnsi="Consolas"/>
-          <w:sz w:val="19"/>
-        </w:rPr>
-        <w:t xml:space="preserve">            int MaxIterations = 4;</w:t>
-      </w:r>
-    </w:p>
-    <w:p>
-      <w:pPr>
-        <w:pStyle w:val="NoSpacing"/>
-        <w:rPr>
-          <w:rFonts w:ascii="Consolas" w:hAnsi="Consolas"/>
-          <w:sz w:val="19"/>
-        </w:rPr>
-      </w:pPr>
-    </w:p>
-    <w:p>
-      <w:pPr>
-        <w:pStyle w:val="NoSpacing"/>
-        <w:rPr>
-          <w:rFonts w:ascii="Consolas" w:hAnsi="Consolas"/>
-          <w:sz w:val="19"/>
-        </w:rPr>
-      </w:pPr>
-      <w:r>
-        <w:rPr>
-          <w:rFonts w:ascii="Consolas" w:hAnsi="Consolas"/>
-          <w:sz w:val="19"/>
-        </w:rPr>
-        <w:t xml:space="preserve">            Console.WriteLine("\n Multi-Agent collaboration started...");</w:t>
-      </w:r>
-    </w:p>
-    <w:p>
-      <w:pPr>
-        <w:pStyle w:val="NoSpacing"/>
-        <w:rPr>
-          <w:rFonts w:ascii="Consolas" w:hAnsi="Consolas"/>
-          <w:sz w:val="19"/>
-        </w:rPr>
-      </w:pPr>
-    </w:p>
-    <w:p>
-      <w:pPr>
-        <w:pStyle w:val="NoSpacing"/>
-        <w:rPr>
-          <w:rFonts w:ascii="Consolas" w:hAnsi="Consolas"/>
-          <w:sz w:val="19"/>
-        </w:rPr>
-      </w:pPr>
-      <w:r>
-        <w:rPr>
-          <w:rFonts w:ascii="Consolas" w:hAnsi="Consolas"/>
-          <w:sz w:val="19"/>
-        </w:rPr>
-        <w:t xml:space="preserve">            while (!isComplete &amp;&amp; currentIteration </w:t>
-      </w:r>
+        <w:t xml:space="preserve">                chatHistory.Insert(0, new ChatMessageContent(AuthorRole.System, copywriterPersona));</w:t>
+      </w:r>
+    </w:p>
+    <w:p>
+      <w:pPr>
+        <w:pStyle w:val="NoSpacing"/>
+        <w:rPr>
+          <w:rFonts w:ascii="Consolas" w:hAnsi="Consolas"/>
+          <w:sz w:val="19"/>
+        </w:rPr>
+      </w:pPr>
+      <w:r>
+        <w:rPr>
+          <w:rFonts w:ascii="Consolas" w:hAnsi="Consolas"/>
+          <w:sz w:val="19"/>
+        </w:rPr>
+        <w:t xml:space="preserve">                ChatMessageContent copywriterResult;</w:t>
+      </w:r>
+    </w:p>
+    <w:p>
+      <w:pPr>
+        <w:pStyle w:val="NoSpacing"/>
+        <w:rPr>
+          <w:rFonts w:ascii="Consolas" w:hAnsi="Consolas"/>
+          <w:sz w:val="19"/>
+        </w:rPr>
+      </w:pPr>
+      <w:r>
+        <w:rPr>
+          <w:rFonts w:ascii="Consolas" w:hAnsi="Consolas"/>
+          <w:sz w:val="19"/>
+        </w:rPr>
+        <w:t xml:space="preserve">                try</w:t>
+      </w:r>
+    </w:p>
+    <w:p>
+      <w:pPr>
+        <w:pStyle w:val="NoSpacing"/>
+        <w:rPr>
+          <w:rFonts w:ascii="Consolas" w:hAnsi="Consolas"/>
+          <w:sz w:val="19"/>
+        </w:rPr>
+      </w:pPr>
+      <w:r>
+        <w:rPr>
+          <w:rFonts w:ascii="Consolas" w:hAnsi="Consolas"/>
+          <w:sz w:val="19"/>
+        </w:rPr>
+        <w:t xml:space="preserve">                {</w:t>
+      </w:r>
+    </w:p>
+    <w:p>
+      <w:pPr>
+        <w:pStyle w:val="NoSpacing"/>
+        <w:rPr>
+          <w:rFonts w:ascii="Consolas" w:hAnsi="Consolas"/>
+          <w:sz w:val="19"/>
+        </w:rPr>
+      </w:pPr>
+      <w:r>
+        <w:rPr>
+          <w:rFonts w:ascii="Consolas" w:hAnsi="Consolas"/>
+          <w:sz w:val="19"/>
+        </w:rPr>
+        <w:t xml:space="preserve">                    // Step 5: Guard the API call so a transient Gemini failure reports</w:t>
+      </w:r>
+    </w:p>
+    <w:p>
+      <w:pPr>
+        <w:pStyle w:val="NoSpacing"/>
+        <w:rPr>
+          <w:rFonts w:ascii="Consolas" w:hAnsi="Consolas"/>
+          <w:sz w:val="19"/>
+        </w:rPr>
+      </w:pPr>
+      <w:r>
+        <w:rPr>
+          <w:rFonts w:ascii="Consolas" w:hAnsi="Consolas"/>
+          <w:sz w:val="19"/>
+        </w:rPr>
+        <w:t xml:space="preserve">                    // cleanly instead of crashing the app mid-collaboration.</w:t>
+      </w:r>
+    </w:p>
+    <w:p>
+      <w:pPr>
+        <w:pStyle w:val="NoSpacing"/>
+        <w:rPr>
+          <w:rFonts w:ascii="Consolas" w:hAnsi="Consolas"/>
+          <w:sz w:val="19"/>
+        </w:rPr>
+      </w:pPr>
+      <w:r>
+        <w:rPr>
+          <w:rFonts w:ascii="Consolas" w:hAnsi="Consolas"/>
+          <w:sz w:val="19"/>
+        </w:rPr>
+        <w:t xml:space="preserve">                    copywriterResult = await chatService.GetChatMessageContentAsync(chatHistory, kernel: kernel);</w:t>
+      </w:r>
+    </w:p>
+    <w:p>
+      <w:pPr>
+        <w:pStyle w:val="NoSpacing"/>
+        <w:rPr>
+          <w:rFonts w:ascii="Consolas" w:hAnsi="Consolas"/>
+          <w:sz w:val="19"/>
+        </w:rPr>
+      </w:pPr>
+      <w:r>
+        <w:rPr>
+          <w:rFonts w:ascii="Consolas" w:hAnsi="Consolas"/>
+          <w:sz w:val="19"/>
+        </w:rPr>
+        <w:t xml:space="preserve">                }</w:t>
+      </w:r>
+    </w:p>
+    <w:p>
+      <w:pPr>
+        <w:pStyle w:val="NoSpacing"/>
+        <w:rPr>
+          <w:rFonts w:ascii="Consolas" w:hAnsi="Consolas"/>
+          <w:sz w:val="19"/>
+        </w:rPr>
+      </w:pPr>
+      <w:r>
+        <w:rPr>
+          <w:rFonts w:ascii="Consolas" w:hAnsi="Consolas"/>
+          <w:sz w:val="19"/>
+        </w:rPr>
+        <w:t xml:space="preserve">                catch (Exception ex)</w:t>
+      </w:r>
+    </w:p>
+    <w:p>
+      <w:pPr>
+        <w:pStyle w:val="NoSpacing"/>
+        <w:rPr>
+          <w:rFonts w:ascii="Consolas" w:hAnsi="Consolas"/>
+          <w:sz w:val="19"/>
+        </w:rPr>
+      </w:pPr>
+      <w:r>
+        <w:rPr>
+          <w:rFonts w:ascii="Consolas" w:hAnsi="Consolas"/>
+          <w:sz w:val="19"/>
+        </w:rPr>
+        <w:t xml:space="preserve">                {</w:t>
+      </w:r>
+    </w:p>
+    <w:p>
+      <w:pPr>
+        <w:pStyle w:val="NoSpacing"/>
+        <w:rPr>
+          <w:rFonts w:ascii="Consolas" w:hAnsi="Consolas"/>
+          <w:sz w:val="19"/>
+        </w:rPr>
+      </w:pPr>
+      <w:r>
+        <w:rPr>
+          <w:rFonts w:ascii="Consolas" w:hAnsi="Consolas"/>
+          <w:sz w:val="19"/>
+        </w:rPr>
+        <w:t xml:space="preserve">                    Console.WriteLine($"\n[ERROR] Copywriter call failed: {ex.Message}");</w:t>
+      </w:r>
+    </w:p>
+    <w:p>
+      <w:pPr>
+        <w:pStyle w:val="NoSpacing"/>
+        <w:rPr>
+          <w:rFonts w:ascii="Consolas" w:hAnsi="Consolas"/>
+          <w:sz w:val="19"/>
+        </w:rPr>
+      </w:pPr>
+      <w:r>
+        <w:rPr>
+          <w:rFonts w:ascii="Consolas" w:hAnsi="Consolas"/>
+          <w:sz w:val="19"/>
+        </w:rPr>
+        <w:t xml:space="preserve">                    chatHistory.RemoveAt(0);</w:t>
+      </w:r>
+    </w:p>
+    <w:p>
+      <w:pPr>
+        <w:pStyle w:val="NoSpacing"/>
+        <w:rPr>
+          <w:rFonts w:ascii="Consolas" w:hAnsi="Consolas"/>
+          <w:sz w:val="19"/>
+        </w:rPr>
+      </w:pPr>
+      <w:r>
+        <w:rPr>
+          <w:rFonts w:ascii="Consolas" w:hAnsi="Consolas"/>
+          <w:sz w:val="19"/>
+        </w:rPr>
+        <w:t xml:space="preserve">                    hadError = true;</w:t>
+      </w:r>
+    </w:p>
+    <w:p>
+      <w:pPr>
+        <w:pStyle w:val="NoSpacing"/>
+        <w:rPr>
+          <w:rFonts w:ascii="Consolas" w:hAnsi="Consolas"/>
+          <w:sz w:val="19"/>
+        </w:rPr>
+      </w:pPr>
+      <w:r>
+        <w:rPr>
+          <w:rFonts w:ascii="Consolas" w:hAnsi="Consolas"/>
+          <w:sz w:val="19"/>
+        </w:rPr>
+        <w:t xml:space="preserve">                    break;</w:t>
+      </w:r>
+    </w:p>
+    <w:p>
+      <w:pPr>
+        <w:pStyle w:val="NoSpacing"/>
+        <w:rPr>
+          <w:rFonts w:ascii="Consolas" w:hAnsi="Consolas"/>
+          <w:sz w:val="19"/>
+        </w:rPr>
+      </w:pPr>
+      <w:r>
+        <w:rPr>
+          <w:rFonts w:ascii="Consolas" w:hAnsi="Consolas"/>
+          <w:sz w:val="19"/>
+        </w:rPr>
+        <w:t xml:space="preserve">                }</w:t>
+      </w:r>
+    </w:p>
+    <w:p>
+      <w:pPr>
+        <w:pStyle w:val="NoSpacing"/>
+        <w:rPr>
+          <w:rFonts w:ascii="Consolas" w:hAnsi="Consolas"/>
+          <w:sz w:val="19"/>
+        </w:rPr>
+      </w:pPr>
+    </w:p>
+    <w:p>
+      <w:pPr>
+        <w:pStyle w:val="NoSpacing"/>
+        <w:rPr>
+          <w:rFonts w:ascii="Consolas" w:hAnsi="Consolas"/>
+          <w:sz w:val="19"/>
+        </w:rPr>
+      </w:pPr>
+      <w:r>
+        <w:rPr>
+          <w:rFonts w:ascii="Consolas" w:hAnsi="Consolas"/>
+          <w:sz w:val="19"/>
+        </w:rPr>
+        <w:t xml:space="preserve">                // Cleanup the system Persona at index 0</w:t>
+      </w:r>
+    </w:p>
+    <w:p>
+      <w:pPr>
+        <w:pStyle w:val="NoSpacing"/>
+        <w:rPr>
+          <w:rFonts w:ascii="Consolas" w:hAnsi="Consolas"/>
+          <w:sz w:val="19"/>
+        </w:rPr>
+      </w:pPr>
+      <w:r>
+        <w:rPr>
+          <w:rFonts w:ascii="Consolas" w:hAnsi="Consolas"/>
+          <w:sz w:val="19"/>
+        </w:rPr>
+        <w:t xml:space="preserve">                chatHistory.RemoveAt(0);</w:t>
+      </w:r>
+    </w:p>
+    <w:p>
+      <w:pPr>
+        <w:pStyle w:val="NoSpacing"/>
+        <w:rPr>
+          <w:rFonts w:ascii="Consolas" w:hAnsi="Consolas"/>
+          <w:sz w:val="19"/>
+        </w:rPr>
+      </w:pPr>
+    </w:p>
+    <w:p>
+      <w:pPr>
+        <w:pStyle w:val="NoSpacing"/>
+        <w:rPr>
+          <w:rFonts w:ascii="Consolas" w:hAnsi="Consolas"/>
+          <w:sz w:val="19"/>
+        </w:rPr>
+      </w:pPr>
+      <w:r>
+        <w:rPr>
+          <w:rFonts w:ascii="Consolas" w:hAnsi="Consolas"/>
+          <w:sz w:val="19"/>
+        </w:rPr>
+        <w:t xml:space="preserve">                string slogan = copywriterResult.Content ?? "No slogan generated.";</w:t>
+      </w:r>
+    </w:p>
+    <w:p>
+      <w:pPr>
+        <w:pStyle w:val="NoSpacing"/>
+        <w:rPr>
+          <w:rFonts w:ascii="Consolas" w:hAnsi="Consolas"/>
+          <w:sz w:val="19"/>
+        </w:rPr>
+      </w:pPr>
+      <w:r>
+        <w:rPr>
+          <w:rFonts w:ascii="Consolas" w:hAnsi="Consolas"/>
+          <w:sz w:val="19"/>
+        </w:rPr>
+        <w:t xml:space="preserve">                chatHistory.AddAssistantMessage(slogan);</w:t>
+      </w:r>
+    </w:p>
+    <w:p>
+      <w:pPr>
+        <w:pStyle w:val="NoSpacing"/>
+        <w:rPr>
+          <w:rFonts w:ascii="Consolas" w:hAnsi="Consolas"/>
+          <w:sz w:val="19"/>
+        </w:rPr>
+      </w:pPr>
+      <w:r>
+        <w:rPr>
+          <w:rFonts w:ascii="Consolas" w:hAnsi="Consolas"/>
+          <w:sz w:val="19"/>
+        </w:rPr>
+        <w:t xml:space="preserve">                Console.WriteLine($"\n[COPYWRITER]: {slogan}");</w:t>
+      </w:r>
+    </w:p>
+    <w:p>
+      <w:pPr>
+        <w:pStyle w:val="NoSpacing"/>
+        <w:rPr>
+          <w:rFonts w:ascii="Consolas" w:hAnsi="Consolas"/>
+          <w:sz w:val="19"/>
+        </w:rPr>
+      </w:pPr>
+    </w:p>
+    <w:p>
+      <w:pPr>
+        <w:pStyle w:val="NoSpacing"/>
+        <w:rPr>
+          <w:rFonts w:ascii="Consolas" w:hAnsi="Consolas"/>
+          <w:sz w:val="19"/>
+        </w:rPr>
+      </w:pPr>
+      <w:r>
+        <w:rPr>
+          <w:rFonts w:ascii="Consolas" w:hAnsi="Consolas"/>
+          <w:sz w:val="19"/>
+        </w:rPr>
+        <w:t xml:space="preserve">                // --- GEMINI PROTOCOL NUDGE ---</w:t>
+      </w:r>
+    </w:p>
+    <w:p>
+      <w:pPr>
+        <w:pStyle w:val="NoSpacing"/>
+        <w:rPr>
+          <w:rFonts w:ascii="Consolas" w:hAnsi="Consolas"/>
+          <w:sz w:val="19"/>
+        </w:rPr>
+      </w:pPr>
+      <w:r>
+        <w:rPr>
+          <w:rFonts w:ascii="Consolas" w:hAnsi="Consolas"/>
+          <w:sz w:val="19"/>
+        </w:rPr>
+        <w:t xml:space="preserve">                // Gemini requires User -&gt; Assistant alternating conversation</w:t>
+      </w:r>
+    </w:p>
+    <w:p>
+      <w:pPr>
+        <w:pStyle w:val="NoSpacing"/>
+        <w:rPr>
+          <w:rFonts w:ascii="Consolas" w:hAnsi="Consolas"/>
+          <w:sz w:val="19"/>
+        </w:rPr>
+      </w:pPr>
+      <w:r>
+        <w:rPr>
+          <w:rFonts w:ascii="Consolas" w:hAnsi="Consolas"/>
+          <w:sz w:val="19"/>
+        </w:rPr>
+        <w:t xml:space="preserve">                // We add a 'User' instruction to prepare for the Editor's turn</w:t>
+      </w:r>
+    </w:p>
+    <w:p>
+      <w:pPr>
+        <w:pStyle w:val="NoSpacing"/>
+        <w:rPr>
+          <w:rFonts w:ascii="Consolas" w:hAnsi="Consolas"/>
+          <w:sz w:val="19"/>
+        </w:rPr>
+      </w:pPr>
+      <w:r>
+        <w:rPr>
+          <w:rFonts w:ascii="Consolas" w:hAnsi="Consolas"/>
+          <w:sz w:val="19"/>
+        </w:rPr>
+        <w:t xml:space="preserve">                chatHistory.AddUserMessage("Editor, please review the slogan above.");</w:t>
+      </w:r>
+    </w:p>
+    <w:p>
+      <w:pPr>
+        <w:pStyle w:val="NoSpacing"/>
+        <w:rPr>
+          <w:rFonts w:ascii="Consolas" w:hAnsi="Consolas"/>
+          <w:sz w:val="19"/>
+        </w:rPr>
+      </w:pPr>
+    </w:p>
+    <w:p>
+      <w:pPr>
+        <w:pStyle w:val="NoSpacing"/>
+        <w:rPr>
+          <w:rFonts w:ascii="Consolas" w:hAnsi="Consolas"/>
+          <w:sz w:val="19"/>
+        </w:rPr>
+      </w:pPr>
+      <w:r>
+        <w:rPr>
+          <w:rFonts w:ascii="Consolas" w:hAnsi="Consolas"/>
+          <w:sz w:val="19"/>
+        </w:rPr>
+        <w:t xml:space="preserve">                // ---------------------------</w:t>
+      </w:r>
+    </w:p>
+    <w:p>
+      <w:pPr>
+        <w:pStyle w:val="NoSpacing"/>
+        <w:rPr>
+          <w:rFonts w:ascii="Consolas" w:hAnsi="Consolas"/>
+          <w:sz w:val="19"/>
+        </w:rPr>
+      </w:pPr>
+      <w:r>
+        <w:rPr>
+          <w:rFonts w:ascii="Consolas" w:hAnsi="Consolas"/>
+          <w:sz w:val="19"/>
+        </w:rPr>
+        <w:t xml:space="preserve">                // Editor turn</w:t>
+      </w:r>
+    </w:p>
+    <w:p>
+      <w:pPr>
+        <w:pStyle w:val="NoSpacing"/>
+        <w:rPr>
+          <w:rFonts w:ascii="Consolas" w:hAnsi="Consolas"/>
+          <w:sz w:val="19"/>
+        </w:rPr>
+      </w:pPr>
+      <w:r>
+        <w:rPr>
+          <w:rFonts w:ascii="Consolas" w:hAnsi="Consolas"/>
+          <w:sz w:val="19"/>
+        </w:rPr>
+        <w:t xml:space="preserve">                // ---------------------------</w:t>
+      </w:r>
+    </w:p>
+    <w:p>
+      <w:pPr>
+        <w:pStyle w:val="NoSpacing"/>
+        <w:rPr>
+          <w:rFonts w:ascii="Consolas" w:hAnsi="Consolas"/>
+          <w:sz w:val="19"/>
+        </w:rPr>
+      </w:pPr>
+      <w:r>
+        <w:rPr>
+          <w:rFonts w:ascii="Consolas" w:hAnsi="Consolas"/>
+          <w:sz w:val="19"/>
+        </w:rPr>
+        <w:t xml:space="preserve">                chatHistory.Insert(0, new ChatMessageContent(AuthorRole.System, editorPersona));</w:t>
+      </w:r>
+    </w:p>
+    <w:p>
+      <w:pPr>
+        <w:pStyle w:val="NoSpacing"/>
+        <w:rPr>
+          <w:rFonts w:ascii="Consolas" w:hAnsi="Consolas"/>
+          <w:sz w:val="19"/>
+        </w:rPr>
+      </w:pPr>
+    </w:p>
+    <w:p>
+      <w:pPr>
+        <w:pStyle w:val="NoSpacing"/>
+        <w:rPr>
+          <w:rFonts w:ascii="Consolas" w:hAnsi="Consolas"/>
+          <w:sz w:val="19"/>
+        </w:rPr>
+      </w:pPr>
+      <w:r>
+        <w:rPr>
+          <w:rFonts w:ascii="Consolas" w:hAnsi="Consolas"/>
+          <w:sz w:val="19"/>
+        </w:rPr>
+        <w:t xml:space="preserve">                ChatMessageContent editorResult;</w:t>
+      </w:r>
+    </w:p>
+    <w:p>
+      <w:pPr>
+        <w:pStyle w:val="NoSpacing"/>
+        <w:rPr>
+          <w:rFonts w:ascii="Consolas" w:hAnsi="Consolas"/>
+          <w:sz w:val="19"/>
+        </w:rPr>
+      </w:pPr>
+      <w:r>
+        <w:rPr>
+          <w:rFonts w:ascii="Consolas" w:hAnsi="Consolas"/>
+          <w:sz w:val="19"/>
+        </w:rPr>
+        <w:t xml:space="preserve">                try</w:t>
+      </w:r>
+    </w:p>
+    <w:p>
+      <w:pPr>
+        <w:pStyle w:val="NoSpacing"/>
+        <w:rPr>
+          <w:rFonts w:ascii="Consolas" w:hAnsi="Consolas"/>
+          <w:sz w:val="19"/>
+        </w:rPr>
+      </w:pPr>
+      <w:r>
+        <w:rPr>
+          <w:rFonts w:ascii="Consolas" w:hAnsi="Consolas"/>
+          <w:sz w:val="19"/>
+        </w:rPr>
+        <w:t xml:space="preserve">                {</w:t>
+      </w:r>
+    </w:p>
+    <w:p>
+      <w:pPr>
+        <w:pStyle w:val="NoSpacing"/>
+        <w:rPr>
+          <w:rFonts w:ascii="Consolas" w:hAnsi="Consolas"/>
+          <w:sz w:val="19"/>
+        </w:rPr>
+      </w:pPr>
+      <w:r>
+        <w:rPr>
+          <w:rFonts w:ascii="Consolas" w:hAnsi="Consolas"/>
+          <w:sz w:val="19"/>
+        </w:rPr>
+        <w:t xml:space="preserve">                    // Step 5: Same guard as the Copywriter call - fail loudly but</w:t>
+      </w:r>
+    </w:p>
+    <w:p>
+      <w:pPr>
+        <w:pStyle w:val="NoSpacing"/>
+        <w:rPr>
+          <w:rFonts w:ascii="Consolas" w:hAnsi="Consolas"/>
+          <w:sz w:val="19"/>
+        </w:rPr>
+      </w:pPr>
+      <w:r>
+        <w:rPr>
+          <w:rFonts w:ascii="Consolas" w:hAnsi="Consolas"/>
+          <w:sz w:val="19"/>
+        </w:rPr>
+        <w:t xml:space="preserve">                    // gracefully instead of taking the whole session down.</w:t>
+      </w:r>
+    </w:p>
+    <w:p>
+      <w:pPr>
+        <w:pStyle w:val="NoSpacing"/>
+        <w:rPr>
+          <w:rFonts w:ascii="Consolas" w:hAnsi="Consolas"/>
+          <w:sz w:val="19"/>
+        </w:rPr>
+      </w:pPr>
+      <w:r>
+        <w:rPr>
+          <w:rFonts w:ascii="Consolas" w:hAnsi="Consolas"/>
+          <w:sz w:val="19"/>
+        </w:rPr>
+        <w:t xml:space="preserve">                    editorResult = await chatService.GetChatMessageContentAsync(chatHistory, kernel: kernel);</w:t>
+      </w:r>
+    </w:p>
+    <w:p>
+      <w:pPr>
+        <w:pStyle w:val="NoSpacing"/>
+        <w:rPr>
+          <w:rFonts w:ascii="Consolas" w:hAnsi="Consolas"/>
+          <w:sz w:val="19"/>
+        </w:rPr>
+      </w:pPr>
+      <w:r>
+        <w:rPr>
+          <w:rFonts w:ascii="Consolas" w:hAnsi="Consolas"/>
+          <w:sz w:val="19"/>
+        </w:rPr>
+        <w:t xml:space="preserve">                }</w:t>
+      </w:r>
+    </w:p>
+    <w:p>
+      <w:pPr>
+        <w:pStyle w:val="NoSpacing"/>
+        <w:rPr>
+          <w:rFonts w:ascii="Consolas" w:hAnsi="Consolas"/>
+          <w:sz w:val="19"/>
+        </w:rPr>
+      </w:pPr>
+      <w:r>
+        <w:rPr>
+          <w:rFonts w:ascii="Consolas" w:hAnsi="Consolas"/>
+          <w:sz w:val="19"/>
+        </w:rPr>
+        <w:t xml:space="preserve">                </w:t>
+      </w:r>
+      <w:r>
+        <w:rPr>
+          <w:rFonts w:ascii="Consolas" w:hAnsi="Consolas"/>
+          <w:sz w:val="19"/>
+        </w:rPr>
+        <w:t>catch (Exception ex)</w:t>
+      </w:r>
+    </w:p>
+    <w:p>
+      <w:pPr>
+        <w:pStyle w:val="NoSpacing"/>
+        <w:rPr>
+          <w:rFonts w:ascii="Consolas" w:hAnsi="Consolas"/>
+          <w:sz w:val="19"/>
+        </w:rPr>
+      </w:pPr>
+      <w:r>
+        <w:rPr>
+          <w:rFonts w:ascii="Consolas" w:hAnsi="Consolas"/>
+          <w:sz w:val="19"/>
+        </w:rPr>
+        <w:t xml:space="preserve">                {</w:t>
+      </w:r>
+    </w:p>
+    <w:p>
+      <w:pPr>
+        <w:pStyle w:val="NoSpacing"/>
+        <w:rPr>
+          <w:rFonts w:ascii="Consolas" w:hAnsi="Consolas"/>
+          <w:sz w:val="19"/>
+        </w:rPr>
+      </w:pPr>
+      <w:r>
+        <w:rPr>
+          <w:rFonts w:ascii="Consolas" w:hAnsi="Consolas"/>
+          <w:sz w:val="19"/>
+        </w:rPr>
+        <w:t xml:space="preserve">                    Console.WriteLine($"\n[ERROR] Editor call failed: {ex.Message}");</w:t>
+      </w:r>
+    </w:p>
+    <w:p>
+      <w:pPr>
+        <w:pStyle w:val="NoSpacing"/>
+        <w:rPr>
+          <w:rFonts w:ascii="Consolas" w:hAnsi="Consolas"/>
+          <w:sz w:val="19"/>
+        </w:rPr>
+      </w:pPr>
+      <w:r>
+        <w:rPr>
+          <w:rFonts w:ascii="Consolas" w:hAnsi="Consolas"/>
+          <w:sz w:val="19"/>
+        </w:rPr>
+        <w:t xml:space="preserve">                    chatHistory.RemoveAt(0);</w:t>
+      </w:r>
+    </w:p>
+    <w:p>
+      <w:pPr>
+        <w:pStyle w:val="NoSpacing"/>
+        <w:rPr>
+          <w:rFonts w:ascii="Consolas" w:hAnsi="Consolas"/>
+          <w:sz w:val="19"/>
+        </w:rPr>
+      </w:pPr>
+      <w:r>
+        <w:rPr>
+          <w:rFonts w:ascii="Consolas" w:hAnsi="Consolas"/>
+          <w:sz w:val="19"/>
+        </w:rPr>
+        <w:t xml:space="preserve">                    hadError = true;</w:t>
+      </w:r>
+    </w:p>
+    <w:p>
+      <w:pPr>
+        <w:pStyle w:val="NoSpacing"/>
+        <w:rPr>
+          <w:rFonts w:ascii="Consolas" w:hAnsi="Consolas"/>
+          <w:sz w:val="19"/>
+        </w:rPr>
+      </w:pPr>
+      <w:r>
+        <w:rPr>
+          <w:rFonts w:ascii="Consolas" w:hAnsi="Consolas"/>
+          <w:sz w:val="19"/>
+        </w:rPr>
+        <w:t xml:space="preserve">                    break;</w:t>
+      </w:r>
+    </w:p>
+    <w:p>
+      <w:pPr>
+        <w:pStyle w:val="NoSpacing"/>
+        <w:rPr>
+          <w:rFonts w:ascii="Consolas" w:hAnsi="Consolas"/>
+          <w:sz w:val="19"/>
+        </w:rPr>
+      </w:pPr>
+      <w:r>
+        <w:rPr>
+          <w:rFonts w:ascii="Consolas" w:hAnsi="Consolas"/>
+          <w:sz w:val="19"/>
+        </w:rPr>
+        <w:t xml:space="preserve">                }</w:t>
+      </w:r>
+    </w:p>
+    <w:p>
+      <w:pPr>
+        <w:pStyle w:val="NoSpacing"/>
+        <w:rPr>
+          <w:rFonts w:ascii="Consolas" w:hAnsi="Consolas"/>
+          <w:sz w:val="19"/>
+        </w:rPr>
+      </w:pPr>
+    </w:p>
+    <w:p>
+      <w:pPr>
+        <w:pStyle w:val="NoSpacing"/>
+        <w:rPr>
+          <w:rFonts w:ascii="Consolas" w:hAnsi="Consolas"/>
+          <w:sz w:val="19"/>
+        </w:rPr>
+      </w:pPr>
+      <w:r>
+        <w:rPr>
+          <w:rFonts w:ascii="Consolas" w:hAnsi="Consolas"/>
+          <w:sz w:val="19"/>
+        </w:rPr>
+        <w:t xml:space="preserve">                chatHistory.RemoveAt(0);</w:t>
+      </w:r>
+    </w:p>
+    <w:p>
+      <w:pPr>
+        <w:pStyle w:val="NoSpacing"/>
+        <w:rPr>
+          <w:rFonts w:ascii="Consolas" w:hAnsi="Consolas"/>
+          <w:sz w:val="19"/>
+        </w:rPr>
+      </w:pPr>
+    </w:p>
+    <w:p>
+      <w:pPr>
+        <w:pStyle w:val="NoSpacing"/>
+        <w:rPr>
+          <w:rFonts w:ascii="Consolas" w:hAnsi="Consolas"/>
+          <w:sz w:val="19"/>
+        </w:rPr>
+      </w:pPr>
+      <w:r>
+        <w:rPr>
+          <w:rFonts w:ascii="Consolas" w:hAnsi="Consolas"/>
+          <w:sz w:val="19"/>
+        </w:rPr>
+        <w:t xml:space="preserve">                string review = editorResult</w:t>
+      </w:r>
+      <w:r>
+        <w:rPr>
+          <w:rFonts w:ascii="Consolas" w:hAnsi="Consolas"/>
+          <w:sz w:val="19"/>
+        </w:rPr>
+        <w:t>.Content ?? "No review generated.";</w:t>
+      </w:r>
+    </w:p>
+    <w:p>
+      <w:pPr>
+        <w:pStyle w:val="NoSpacing"/>
+        <w:rPr>
+          <w:rFonts w:ascii="Consolas" w:hAnsi="Consolas"/>
+          <w:sz w:val="19"/>
+        </w:rPr>
+      </w:pPr>
+      <w:r>
+        <w:rPr>
+          <w:rFonts w:ascii="Consolas" w:hAnsi="Consolas"/>
+          <w:sz w:val="19"/>
+        </w:rPr>
+        <w:t xml:space="preserve">                chatHistory.AddAssistantMessage(review);</w:t>
+      </w:r>
+    </w:p>
+    <w:p>
+      <w:pPr>
+        <w:pStyle w:val="NoSpacing"/>
+        <w:rPr>
+          <w:rFonts w:ascii="Consolas" w:hAnsi="Consolas"/>
+          <w:sz w:val="19"/>
+        </w:rPr>
+      </w:pPr>
+      <w:r>
+        <w:rPr>
+          <w:rFonts w:ascii="Consolas" w:hAnsi="Consolas"/>
+          <w:sz w:val="19"/>
+        </w:rPr>
+        <w:t xml:space="preserve">                Console.WriteLine($"\n[EDITOR]: {review}");</w:t>
+      </w:r>
+    </w:p>
+    <w:p>
+      <w:pPr>
+        <w:pStyle w:val="NoSpacing"/>
+        <w:rPr>
+          <w:rFonts w:ascii="Consolas" w:hAnsi="Consolas"/>
+          <w:sz w:val="19"/>
+        </w:rPr>
+      </w:pPr>
+    </w:p>
+    <w:p>
+      <w:pPr>
+        <w:pStyle w:val="NoSpacing"/>
+        <w:rPr>
+          <w:rFonts w:ascii="Consolas" w:hAnsi="Consolas"/>
+          <w:sz w:val="19"/>
+        </w:rPr>
+      </w:pPr>
       <w:r>
         <w:rPr>
           <w:rFonts w:ascii="Consolas" w:hAnsi="Consolas"/>
           <w:sz w:val="19"/>
         </w:rPr>
         <w:lastRenderedPageBreak/>
-        <w:t>&lt; MaxIterations)</w:t>
-      </w:r>
-    </w:p>
-    <w:p>
-      <w:pPr>
-        <w:pStyle w:val="NoSpacing"/>
-        <w:rPr>
-          <w:rFonts w:ascii="Consolas" w:hAnsi="Consolas"/>
-          <w:sz w:val="19"/>
-        </w:rPr>
-      </w:pPr>
-      <w:r>
-        <w:rPr>
-          <w:rFonts w:ascii="Consolas" w:hAnsi="Consolas"/>
-          <w:sz w:val="19"/>
-        </w:rPr>
-        <w:t xml:space="preserve">            {</w:t>
-      </w:r>
-    </w:p>
-    <w:p>
-      <w:pPr>
-        <w:pStyle w:val="NoSpacing"/>
-        <w:rPr>
-          <w:rFonts w:ascii="Consolas" w:hAnsi="Consolas"/>
-          <w:sz w:val="19"/>
-        </w:rPr>
-      </w:pPr>
-      <w:r>
-        <w:rPr>
-          <w:rFonts w:ascii="Consolas" w:hAnsi="Consolas"/>
-          <w:sz w:val="19"/>
-        </w:rPr>
-        <w:t xml:space="preserve">                // ---------------------------</w:t>
-      </w:r>
-    </w:p>
-    <w:p>
-      <w:pPr>
-        <w:pStyle w:val="NoSpacing"/>
-        <w:rPr>
-          <w:rFonts w:ascii="Consolas" w:hAnsi="Consolas"/>
-          <w:sz w:val="19"/>
-        </w:rPr>
-      </w:pPr>
-      <w:r>
-        <w:rPr>
-          <w:rFonts w:ascii="Consolas" w:hAnsi="Consolas"/>
-          <w:sz w:val="19"/>
-        </w:rPr>
-        <w:t xml:space="preserve">                // Copywriter turn</w:t>
-      </w:r>
-    </w:p>
-    <w:p>
-      <w:pPr>
-        <w:pStyle w:val="NoSpacing"/>
-        <w:rPr>
-          <w:rFonts w:ascii="Consolas" w:hAnsi="Consolas"/>
-          <w:sz w:val="19"/>
-        </w:rPr>
-      </w:pPr>
-      <w:r>
-        <w:rPr>
-          <w:rFonts w:ascii="Consolas" w:hAnsi="Consolas"/>
-          <w:sz w:val="19"/>
-        </w:rPr>
-        <w:t xml:space="preserve">                // ---------------------------</w:t>
-      </w:r>
-    </w:p>
-    <w:p>
-      <w:pPr>
-        <w:pStyle w:val="NoSpacing"/>
-        <w:rPr>
-          <w:rFonts w:ascii="Consolas" w:hAnsi="Consolas"/>
-          <w:sz w:val="19"/>
-        </w:rPr>
-      </w:pPr>
-    </w:p>
-    <w:p>
-      <w:pPr>
-        <w:pStyle w:val="NoSpacing"/>
-        <w:rPr>
-          <w:rFonts w:ascii="Consolas" w:hAnsi="Consolas"/>
-          <w:sz w:val="19"/>
-        </w:rPr>
-      </w:pPr>
-      <w:r>
-        <w:rPr>
-          <w:rFonts w:ascii="Consolas" w:hAnsi="Consolas"/>
-          <w:sz w:val="19"/>
-        </w:rPr>
-        <w:t xml:space="preserve">                // Inject the persona at index 0</w:t>
-      </w:r>
-    </w:p>
-    <w:p>
-      <w:pPr>
-        <w:pStyle w:val="NoSpacing"/>
-        <w:rPr>
-          <w:rFonts w:ascii="Consolas" w:hAnsi="Consolas"/>
-          <w:sz w:val="19"/>
-        </w:rPr>
-      </w:pPr>
-      <w:r>
-        <w:rPr>
-          <w:rFonts w:ascii="Consolas" w:hAnsi="Consolas"/>
-          <w:sz w:val="19"/>
-        </w:rPr>
-        <w:t xml:space="preserve">                chatHistory.Insert(0, new ChatMessageContent(AuthorRole.System, copywriterPersona));</w:t>
-      </w:r>
-    </w:p>
-    <w:p>
-      <w:pPr>
-        <w:pStyle w:val="NoSpacing"/>
-        <w:rPr>
-          <w:rFonts w:ascii="Consolas" w:hAnsi="Consolas"/>
-          <w:sz w:val="19"/>
-        </w:rPr>
-      </w:pPr>
-      <w:r>
-        <w:rPr>
-          <w:rFonts w:ascii="Consolas" w:hAnsi="Consolas"/>
-          <w:sz w:val="19"/>
-        </w:rPr>
-        <w:t xml:space="preserve">                var copywriterResult = await chatService.GetChatMessageContentAsync(chatHistory, kernel: kernel);</w:t>
-      </w:r>
-    </w:p>
-    <w:p>
-      <w:pPr>
-        <w:pStyle w:val="NoSpacing"/>
-        <w:rPr>
-          <w:rFonts w:ascii="Consolas" w:hAnsi="Consolas"/>
-          <w:sz w:val="19"/>
-        </w:rPr>
-      </w:pPr>
-    </w:p>
-    <w:p>
-      <w:pPr>
-        <w:pStyle w:val="NoSpacing"/>
-        <w:rPr>
-          <w:rFonts w:ascii="Consolas" w:hAnsi="Consolas"/>
-          <w:sz w:val="19"/>
-        </w:rPr>
-      </w:pPr>
-      <w:r>
-        <w:rPr>
-          <w:rFonts w:ascii="Consolas" w:hAnsi="Consolas"/>
-          <w:sz w:val="19"/>
-        </w:rPr>
-        <w:t xml:space="preserve">                // Cleanup the system Persona at index 0</w:t>
-      </w:r>
-    </w:p>
-    <w:p>
-      <w:pPr>
-        <w:pStyle w:val="NoSpacing"/>
-        <w:rPr>
-          <w:rFonts w:ascii="Consolas" w:hAnsi="Consolas"/>
-          <w:sz w:val="19"/>
-        </w:rPr>
-      </w:pPr>
-      <w:r>
-        <w:rPr>
-          <w:rFonts w:ascii="Consolas" w:hAnsi="Consolas"/>
-          <w:sz w:val="19"/>
-        </w:rPr>
-        <w:t xml:space="preserve">                chatHistory.RemoveAt(0);</w:t>
-      </w:r>
-    </w:p>
-    <w:p>
-      <w:pPr>
-        <w:pStyle w:val="NoSpacing"/>
-        <w:rPr>
-          <w:rFonts w:ascii="Consolas" w:hAnsi="Consolas"/>
-          <w:sz w:val="19"/>
-        </w:rPr>
-      </w:pPr>
-    </w:p>
-    <w:p>
-      <w:pPr>
-        <w:pStyle w:val="NoSpacing"/>
-        <w:rPr>
-          <w:rFonts w:ascii="Consolas" w:hAnsi="Consolas"/>
-          <w:sz w:val="19"/>
-        </w:rPr>
-      </w:pPr>
-      <w:r>
-        <w:rPr>
-          <w:rFonts w:ascii="Consolas" w:hAnsi="Consolas"/>
-          <w:sz w:val="19"/>
-        </w:rPr>
-        <w:t xml:space="preserve">                string slogan = copywriterResult.Content ?? "No slogan generated.";</w:t>
-      </w:r>
-    </w:p>
-    <w:p>
-      <w:pPr>
-        <w:pStyle w:val="NoSpacing"/>
-        <w:rPr>
-          <w:rFonts w:ascii="Consolas" w:hAnsi="Consolas"/>
-          <w:sz w:val="19"/>
-        </w:rPr>
-      </w:pPr>
-      <w:r>
-        <w:rPr>
-          <w:rFonts w:ascii="Consolas" w:hAnsi="Consolas"/>
-          <w:sz w:val="19"/>
-        </w:rPr>
-        <w:t xml:space="preserve">                chatHistory.AddAssistantMessage(slogan);</w:t>
-      </w:r>
-    </w:p>
-    <w:p>
-      <w:pPr>
-        <w:pStyle w:val="NoSpacing"/>
-        <w:rPr>
-          <w:rFonts w:ascii="Consolas" w:hAnsi="Consolas"/>
-          <w:sz w:val="19"/>
-        </w:rPr>
-      </w:pPr>
-      <w:r>
-        <w:rPr>
-          <w:rFonts w:ascii="Consolas" w:hAnsi="Consolas"/>
-          <w:sz w:val="19"/>
-        </w:rPr>
-        <w:t xml:space="preserve">                Console.WriteLine($"\n[COPYWRITER]: {slogan}");</w:t>
-      </w:r>
-    </w:p>
-    <w:p>
-      <w:pPr>
-        <w:pStyle w:val="NoSpacing"/>
-        <w:rPr>
-          <w:rFonts w:ascii="Consolas" w:hAnsi="Consolas"/>
-          <w:sz w:val="19"/>
-        </w:rPr>
-      </w:pPr>
-    </w:p>
-    <w:p>
-      <w:pPr>
-        <w:pStyle w:val="NoSpacing"/>
-        <w:rPr>
-          <w:rFonts w:ascii="Consolas" w:hAnsi="Consolas"/>
-          <w:sz w:val="19"/>
-        </w:rPr>
-      </w:pPr>
-      <w:r>
-        <w:rPr>
-          <w:rFonts w:ascii="Consolas" w:hAnsi="Consolas"/>
-          <w:sz w:val="19"/>
-        </w:rPr>
-        <w:t xml:space="preserve">                // --- GEMINI PROTOCOL NUDGE ---</w:t>
-      </w:r>
-    </w:p>
-    <w:p>
-      <w:pPr>
-        <w:pStyle w:val="NoSpacing"/>
-        <w:rPr>
-          <w:rFonts w:ascii="Consolas" w:hAnsi="Consolas"/>
-          <w:sz w:val="19"/>
-        </w:rPr>
-      </w:pPr>
-      <w:r>
-        <w:rPr>
-          <w:rFonts w:ascii="Consolas" w:hAnsi="Consolas"/>
-          <w:sz w:val="19"/>
-        </w:rPr>
-        <w:t xml:space="preserve">                // Gemini requires User -&gt; Assistant alternating conversation</w:t>
-      </w:r>
-    </w:p>
-    <w:p>
-      <w:pPr>
-        <w:pStyle w:val="NoSpacing"/>
-        <w:rPr>
-          <w:rFonts w:ascii="Consolas" w:hAnsi="Consolas"/>
-          <w:sz w:val="19"/>
-        </w:rPr>
-      </w:pPr>
-      <w:r>
-        <w:rPr>
-          <w:rFonts w:ascii="Consolas" w:hAnsi="Consolas"/>
-          <w:sz w:val="19"/>
-        </w:rPr>
-        <w:t xml:space="preserve">                // We add a 'User' instruction to prepare for the Editor's turn</w:t>
-      </w:r>
-    </w:p>
-    <w:p>
-      <w:pPr>
-        <w:pStyle w:val="NoSpacing"/>
-        <w:rPr>
-          <w:rFonts w:ascii="Consolas" w:hAnsi="Consolas"/>
-          <w:sz w:val="19"/>
-        </w:rPr>
-      </w:pPr>
-      <w:r>
-        <w:rPr>
-          <w:rFonts w:ascii="Consolas" w:hAnsi="Consolas"/>
-          <w:sz w:val="19"/>
-        </w:rPr>
-        <w:t xml:space="preserve">                chatHistory.AddUserMessage("Editor, please review the slogan above.");</w:t>
-      </w:r>
-    </w:p>
-    <w:p>
-      <w:pPr>
-        <w:pStyle w:val="NoSpacing"/>
-        <w:rPr>
-          <w:rFonts w:ascii="Consolas" w:hAnsi="Consolas"/>
-          <w:sz w:val="19"/>
-        </w:rPr>
-      </w:pPr>
-    </w:p>
-    <w:p>
-      <w:pPr>
-        <w:pStyle w:val="NoSpacing"/>
-        <w:rPr>
-          <w:rFonts w:ascii="Consolas" w:hAnsi="Consolas"/>
-          <w:sz w:val="19"/>
-        </w:rPr>
-      </w:pPr>
-      <w:r>
-        <w:rPr>
-          <w:rFonts w:ascii="Consolas" w:hAnsi="Consolas"/>
-          <w:sz w:val="19"/>
-        </w:rPr>
-        <w:t xml:space="preserve">                // ---------------------------</w:t>
-      </w:r>
-    </w:p>
-    <w:p>
-      <w:pPr>
-        <w:pStyle w:val="NoSpacing"/>
-        <w:rPr>
-          <w:rFonts w:ascii="Consolas" w:hAnsi="Consolas"/>
-          <w:sz w:val="19"/>
-        </w:rPr>
-      </w:pPr>
-      <w:r>
-        <w:rPr>
-          <w:rFonts w:ascii="Consolas" w:hAnsi="Consolas"/>
-          <w:sz w:val="19"/>
-        </w:rPr>
-        <w:t xml:space="preserve">                // Editor turn</w:t>
-      </w:r>
-    </w:p>
-    <w:p>
-      <w:pPr>
-        <w:pStyle w:val="NoSpacing"/>
-        <w:rPr>
-          <w:rFonts w:ascii="Consolas" w:hAnsi="Consolas"/>
-          <w:sz w:val="19"/>
-        </w:rPr>
-      </w:pPr>
-      <w:r>
-        <w:rPr>
-          <w:rFonts w:ascii="Consolas" w:hAnsi="Consolas"/>
-          <w:sz w:val="19"/>
-        </w:rPr>
-        <w:t xml:space="preserve">                // ---------------------------</w:t>
-      </w:r>
-    </w:p>
-    <w:p>
-      <w:pPr>
-        <w:pStyle w:val="NoSpacing"/>
-        <w:rPr>
-          <w:rFonts w:ascii="Consolas" w:hAnsi="Consolas"/>
-          <w:sz w:val="19"/>
-        </w:rPr>
-      </w:pPr>
-      <w:r>
-        <w:rPr>
-          <w:rFonts w:ascii="Consolas" w:hAnsi="Consolas"/>
-          <w:sz w:val="19"/>
-        </w:rPr>
-        <w:t xml:space="preserve">                chatHistory.Insert(0, new ChatMessageContent(AuthorRole.System, editorPersona));</w:t>
-      </w:r>
-    </w:p>
-    <w:p>
-      <w:pPr>
-        <w:pStyle w:val="NoSpacing"/>
-        <w:rPr>
-          <w:rFonts w:ascii="Consolas" w:hAnsi="Consolas"/>
-          <w:sz w:val="19"/>
-        </w:rPr>
-      </w:pPr>
-    </w:p>
-    <w:p>
-      <w:pPr>
-        <w:pStyle w:val="NoSpacing"/>
-        <w:rPr>
-          <w:rFonts w:ascii="Consolas" w:hAnsi="Consolas"/>
-          <w:sz w:val="19"/>
-        </w:rPr>
-      </w:pPr>
-      <w:r>
-        <w:rPr>
-          <w:rFonts w:ascii="Consolas" w:hAnsi="Consolas"/>
-          <w:sz w:val="19"/>
-        </w:rPr>
-        <w:t xml:space="preserve">                var editorResult = await chatService.GetChatMessageContentAsync(chatHistory, kernel: kernel);</w:t>
-      </w:r>
-    </w:p>
-    <w:p>
-      <w:pPr>
-        <w:pStyle w:val="NoSpacing"/>
-        <w:rPr>
-          <w:rFonts w:ascii="Consolas" w:hAnsi="Consolas"/>
-          <w:sz w:val="19"/>
-        </w:rPr>
-      </w:pPr>
-    </w:p>
-    <w:p>
-      <w:pPr>
-        <w:pStyle w:val="NoSpacing"/>
-        <w:rPr>
-          <w:rFonts w:ascii="Consolas" w:hAnsi="Consolas"/>
-          <w:sz w:val="19"/>
-        </w:rPr>
-      </w:pPr>
-      <w:r>
-        <w:rPr>
-          <w:rFonts w:ascii="Consolas" w:hAnsi="Consolas"/>
-          <w:sz w:val="19"/>
-        </w:rPr>
-        <w:t xml:space="preserve">                chatHistory.RemoveAt(0);</w:t>
-      </w:r>
-    </w:p>
-    <w:p>
-      <w:pPr>
-        <w:pStyle w:val="NoSpacing"/>
-        <w:rPr>
-          <w:rFonts w:ascii="Consolas" w:hAnsi="Consolas"/>
-          <w:sz w:val="19"/>
-        </w:rPr>
-      </w:pPr>
-    </w:p>
-    <w:p>
-      <w:pPr>
-        <w:pStyle w:val="NoSpacing"/>
-        <w:rPr>
-          <w:rFonts w:ascii="Consolas" w:hAnsi="Consolas"/>
-          <w:sz w:val="19"/>
-        </w:rPr>
-      </w:pPr>
-      <w:r>
-        <w:rPr>
-          <w:rFonts w:ascii="Consolas" w:hAnsi="Consolas"/>
-          <w:sz w:val="19"/>
-        </w:rPr>
-        <w:t xml:space="preserve">                string review = editorResult.Content ?? "No review generated.";</w:t>
-      </w:r>
-    </w:p>
-    <w:p>
-      <w:pPr>
-        <w:pStyle w:val="NoSpacing"/>
-        <w:rPr>
-          <w:rFonts w:ascii="Consolas" w:hAnsi="Consolas"/>
-          <w:sz w:val="19"/>
-        </w:rPr>
-      </w:pPr>
-      <w:r>
-        <w:rPr>
-          <w:rFonts w:ascii="Consolas" w:hAnsi="Consolas"/>
-          <w:sz w:val="19"/>
-        </w:rPr>
-        <w:t xml:space="preserve">                chatHistory.AddAssistantMessage(review);</w:t>
-      </w:r>
-    </w:p>
-    <w:p>
-      <w:pPr>
-        <w:pStyle w:val="NoSpacing"/>
-        <w:rPr>
-          <w:rFonts w:ascii="Consolas" w:hAnsi="Consolas"/>
-          <w:sz w:val="19"/>
-        </w:rPr>
-      </w:pPr>
-      <w:r>
-        <w:rPr>
-          <w:rFonts w:ascii="Consolas" w:hAnsi="Consolas"/>
-          <w:sz w:val="19"/>
-        </w:rPr>
-        <w:t xml:space="preserve">                Console.WriteLine($"\n[EDITOR]: {review}");</w:t>
-      </w:r>
-    </w:p>
-    <w:p>
-      <w:pPr>
-        <w:pStyle w:val="NoSpacing"/>
-        <w:rPr>
-          <w:rFonts w:ascii="Consolas" w:hAnsi="Consolas"/>
-          <w:sz w:val="19"/>
-        </w:rPr>
-      </w:pPr>
-    </w:p>
-    <w:p>
-      <w:pPr>
-        <w:pStyle w:val="NoSpacing"/>
-        <w:rPr>
-          <w:rFonts w:ascii="Consolas" w:hAnsi="Consolas"/>
-          <w:sz w:val="19"/>
-        </w:rPr>
-      </w:pPr>
-      <w:r>
-        <w:rPr>
-          <w:rFonts w:ascii="Consolas" w:hAnsi="Consolas"/>
-          <w:sz w:val="19"/>
-        </w:rPr>
         <w:t xml:space="preserve">                if (review.Contains("APPROVED", StringComparison.OrdinalIgnoreCase))</w:t>
       </w:r>
     </w:p>
@@ -1699,7 +2121,87 @@
           <w:rFonts w:ascii="Consolas" w:hAnsi="Consolas"/>
           <w:sz w:val="19"/>
         </w:rPr>
-        <w:t xml:space="preserve">            Console.WriteLine(isComplete ? "\nWorkflow Finalized." : "\nMax iterations reached.");</w:t>
+        <w:t xml:space="preserve">            if (isComplete)</w:t>
+      </w:r>
+    </w:p>
+    <w:p>
+      <w:pPr>
+        <w:pStyle w:val="NoSpacing"/>
+        <w:rPr>
+          <w:rFonts w:ascii="Consolas" w:hAnsi="Consolas"/>
+          <w:sz w:val="19"/>
+        </w:rPr>
+      </w:pPr>
+      <w:r>
+        <w:rPr>
+          <w:rFonts w:ascii="Consolas" w:hAnsi="Consolas"/>
+          <w:sz w:val="19"/>
+        </w:rPr>
+        <w:t xml:space="preserve">                Console.WriteLine("\nWorkflow Finalized.");</w:t>
+      </w:r>
+    </w:p>
+    <w:p>
+      <w:pPr>
+        <w:pStyle w:val="NoSpacing"/>
+        <w:rPr>
+          <w:rFonts w:ascii="Consolas" w:hAnsi="Consolas"/>
+          <w:sz w:val="19"/>
+        </w:rPr>
+      </w:pPr>
+      <w:r>
+        <w:rPr>
+          <w:rFonts w:ascii="Consolas" w:hAnsi="Consolas"/>
+          <w:sz w:val="19"/>
+        </w:rPr>
+        <w:t xml:space="preserve">            else if (hadError)</w:t>
+      </w:r>
+    </w:p>
+    <w:p>
+      <w:pPr>
+        <w:pStyle w:val="NoSpacing"/>
+        <w:rPr>
+          <w:rFonts w:ascii="Consolas" w:hAnsi="Consolas"/>
+          <w:sz w:val="19"/>
+        </w:rPr>
+      </w:pPr>
+      <w:r>
+        <w:rPr>
+          <w:rFonts w:ascii="Consolas" w:hAnsi="Consolas"/>
+          <w:sz w:val="19"/>
+        </w:rPr>
+        <w:t xml:space="preserve">                Console.WriteLine("\nCollaboration stopped early due to an error.");</w:t>
+      </w:r>
+    </w:p>
+    <w:p>
+      <w:pPr>
+        <w:pStyle w:val="NoSpacing"/>
+        <w:rPr>
+          <w:rFonts w:ascii="Consolas" w:hAnsi="Consolas"/>
+          <w:sz w:val="19"/>
+        </w:rPr>
+      </w:pPr>
+      <w:r>
+        <w:rPr>
+          <w:rFonts w:ascii="Consolas" w:hAnsi="Consolas"/>
+          <w:sz w:val="19"/>
+        </w:rPr>
+        <w:t xml:space="preserve">            else</w:t>
+      </w:r>
+    </w:p>
+    <w:p>
+      <w:pPr>
+        <w:pStyle w:val="NoSpacing"/>
+        <w:rPr>
+          <w:rFonts w:ascii="Consolas" w:hAnsi="Consolas"/>
+          <w:sz w:val="19"/>
+        </w:rPr>
+      </w:pPr>
+      <w:r>
+        <w:rPr>
+          <w:rFonts w:ascii="Consolas" w:hAnsi="Consolas"/>
+          <w:sz w:val="19"/>
+        </w:rPr>
+        <w:t xml:space="preserve">                Console.WriteLine("\nMax iterations reached.");</w:t>
       </w:r>
     </w:p>
     <w:p>

</xml_diff>